<commit_message>
docs: polish lab08 report and presentation metadata
</commit_message>
<xml_diff>
--- a/labs/lab08/release/report.docx
+++ b/labs/lab08/release/report.docx
@@ -18,12 +18,264 @@
         <w:t xml:space="preserve">Реализация основных моделей в дискретно-событийном подходе</w:t>
       </w:r>
     </w:p>
-    <w:bookmarkStart w:id="9" w:name="цель-работы"/>
+    <w:bookmarkStart w:id="10" w:name="титульные-данные"/>
     <w:p>
       <w:pPr>
         <w:pStyle w:val="Heading1"/>
       </w:pPr>
       <w:r>
+        <w:t xml:space="preserve">Титульные данные</w:t>
+      </w:r>
+    </w:p>
+    <w:bookmarkStart w:id="9" w:name="tbl-title"/>
+    <w:p>
+      <w:pPr>
+        <w:pStyle w:val="TableCaption"/>
+      </w:pPr>
+      <w:r>
+        <w:t xml:space="preserve">Сведения о работе</w:t>
+      </w:r>
+    </w:p>
+    <w:tbl>
+      <w:tblPr>
+        <w:tblStyle w:val="Table"/>
+        <w:tblW w:type="pct" w:w="5000"/>
+        <w:tblLayout w:type="fixed"/>
+        <w:tblLook w:firstRow="1" w:lastRow="0" w:firstColumn="0" w:lastColumn="0" w:noHBand="0" w:noVBand="0" w:val="0020"/>
+        <w:tblCaption w:val="Сведения о работе"/>
+      </w:tblPr>
+      <w:tblGrid>
+        <w:gridCol w:w="3960"/>
+        <w:gridCol w:w="3960"/>
+      </w:tblGrid>
+      <w:tr>
+        <w:trPr>
+          <w:tblHeader w:val="on"/>
+        </w:trPr>
+        <w:tc>
+          <w:tcPr/>
+          <w:p>
+            <w:pPr>
+              <w:pStyle w:val="Compact"/>
+            </w:pPr>
+            <w:r>
+              <w:t xml:space="preserve">Поле</w:t>
+            </w:r>
+          </w:p>
+        </w:tc>
+        <w:tc>
+          <w:tcPr/>
+          <w:p>
+            <w:pPr>
+              <w:pStyle w:val="Compact"/>
+            </w:pPr>
+            <w:r>
+              <w:t xml:space="preserve">Значение</w:t>
+            </w:r>
+          </w:p>
+        </w:tc>
+      </w:tr>
+      <w:tr>
+        <w:tc>
+          <w:tcPr/>
+          <w:p>
+            <w:pPr>
+              <w:pStyle w:val="Compact"/>
+            </w:pPr>
+            <w:r>
+              <w:t xml:space="preserve">Дисциплина</w:t>
+            </w:r>
+          </w:p>
+        </w:tc>
+        <w:tc>
+          <w:tcPr/>
+          <w:p>
+            <w:pPr>
+              <w:pStyle w:val="Compact"/>
+            </w:pPr>
+            <w:r>
+              <w:t xml:space="preserve">Имитационное моделирование</w:t>
+            </w:r>
+          </w:p>
+        </w:tc>
+      </w:tr>
+      <w:tr>
+        <w:tc>
+          <w:tcPr/>
+          <w:p>
+            <w:pPr>
+              <w:pStyle w:val="Compact"/>
+            </w:pPr>
+            <w:r>
+              <w:t xml:space="preserve">Тема</w:t>
+            </w:r>
+          </w:p>
+        </w:tc>
+        <w:tc>
+          <w:tcPr/>
+          <w:p>
+            <w:pPr>
+              <w:pStyle w:val="Compact"/>
+            </w:pPr>
+            <w:r>
+              <w:t xml:space="preserve">Реализация основных моделей в дискретно-событийном подходе</w:t>
+            </w:r>
+          </w:p>
+        </w:tc>
+      </w:tr>
+      <w:tr>
+        <w:tc>
+          <w:tcPr/>
+          <w:p>
+            <w:pPr>
+              <w:pStyle w:val="Compact"/>
+            </w:pPr>
+            <w:r>
+              <w:t xml:space="preserve">Автор</w:t>
+            </w:r>
+          </w:p>
+        </w:tc>
+        <w:tc>
+          <w:tcPr/>
+          <w:p>
+            <w:pPr>
+              <w:pStyle w:val="Compact"/>
+            </w:pPr>
+            <w:r>
+              <w:t xml:space="preserve">Гашимов Кенан Мухтар оглы</w:t>
+            </w:r>
+          </w:p>
+        </w:tc>
+      </w:tr>
+      <w:tr>
+        <w:tc>
+          <w:tcPr/>
+          <w:p>
+            <w:pPr>
+              <w:pStyle w:val="Compact"/>
+            </w:pPr>
+            <w:r>
+              <w:t xml:space="preserve">Группа</w:t>
+            </w:r>
+          </w:p>
+        </w:tc>
+        <w:tc>
+          <w:tcPr/>
+          <w:p>
+            <w:pPr>
+              <w:pStyle w:val="Compact"/>
+            </w:pPr>
+            <w:r>
+              <w:t xml:space="preserve">НКНбд-01-23</w:t>
+            </w:r>
+          </w:p>
+        </w:tc>
+      </w:tr>
+      <w:tr>
+        <w:tc>
+          <w:tcPr/>
+          <w:p>
+            <w:pPr>
+              <w:pStyle w:val="Compact"/>
+            </w:pPr>
+            <w:r>
+              <w:t xml:space="preserve">Студенческий билет</w:t>
+            </w:r>
+          </w:p>
+        </w:tc>
+        <w:tc>
+          <w:tcPr/>
+          <w:p>
+            <w:pPr>
+              <w:pStyle w:val="Compact"/>
+            </w:pPr>
+            <w:r>
+              <w:t xml:space="preserve">1032235820</w:t>
+            </w:r>
+          </w:p>
+        </w:tc>
+      </w:tr>
+      <w:tr>
+        <w:tc>
+          <w:tcPr/>
+          <w:p>
+            <w:pPr>
+              <w:pStyle w:val="Compact"/>
+            </w:pPr>
+            <w:r>
+              <w:t xml:space="preserve">Организация</w:t>
+            </w:r>
+          </w:p>
+        </w:tc>
+        <w:tc>
+          <w:tcPr/>
+          <w:p>
+            <w:pPr>
+              <w:pStyle w:val="Compact"/>
+            </w:pPr>
+            <w:r>
+              <w:t xml:space="preserve">Российский университет дружбы народов имени Патриса Лумумбы</w:t>
+            </w:r>
+          </w:p>
+        </w:tc>
+      </w:tr>
+      <w:tr>
+        <w:tc>
+          <w:tcPr/>
+          <w:p>
+            <w:pPr>
+              <w:pStyle w:val="Compact"/>
+            </w:pPr>
+            <w:r>
+              <w:t xml:space="preserve">Город</w:t>
+            </w:r>
+          </w:p>
+        </w:tc>
+        <w:tc>
+          <w:tcPr/>
+          <w:p>
+            <w:pPr>
+              <w:pStyle w:val="Compact"/>
+            </w:pPr>
+            <w:r>
+              <w:t xml:space="preserve">Москва</w:t>
+            </w:r>
+          </w:p>
+        </w:tc>
+      </w:tr>
+      <w:tr>
+        <w:tc>
+          <w:tcPr/>
+          <w:p>
+            <w:pPr>
+              <w:pStyle w:val="Compact"/>
+            </w:pPr>
+            <w:r>
+              <w:t xml:space="preserve">Год</w:t>
+            </w:r>
+          </w:p>
+        </w:tc>
+        <w:tc>
+          <w:tcPr/>
+          <w:p>
+            <w:pPr>
+              <w:pStyle w:val="Compact"/>
+            </w:pPr>
+            <w:r>
+              <w:t xml:space="preserve">2026</w:t>
+            </w:r>
+          </w:p>
+        </w:tc>
+      </w:tr>
+    </w:tbl>
+    <w:bookmarkEnd w:id="9"/>
+    <w:bookmarkEnd w:id="10"/>
+    <w:bookmarkStart w:id="11" w:name="цель-работы"/>
+    <w:p>
+      <w:pPr>
+        <w:pStyle w:val="Heading1"/>
+      </w:pPr>
+      <w:r>
         <w:t xml:space="preserve">Цель работы</w:t>
       </w:r>
     </w:p>
@@ -35,8 +287,8 @@
         <w:t xml:space="preserve">Изучить дискретно-событийный подход к имитационному моделированию на примере классической модели распространения инфекции SIR. Реализовать стохастическую дискретно-событийную модель на языке Julia, выполнить анализ параметров, сравнить варианты модели и подготовить воспроизводимый комплект результатов.</w:t>
       </w:r>
     </w:p>
-    <w:bookmarkEnd w:id="9"/>
-    <w:bookmarkStart w:id="10" w:name="задание"/>
+    <w:bookmarkEnd w:id="11"/>
+    <w:bookmarkStart w:id="12" w:name="задание"/>
     <w:p>
       <w:pPr>
         <w:pStyle w:val="Heading1"/>
@@ -53,8 +305,8 @@
         <w:t xml:space="preserve">В работе требуется создать рабочий каталог, установить необходимые пакеты, выполнить предложенный код, преобразовать его в литературный стиль, сгенерировать чистый код, Jupyter notebook и документацию Quarto, выполнить notebook, интегрировать документацию в отчёт, добавить вычисления для набора параметров и повторить генерацию артефактов.</w:t>
       </w:r>
     </w:p>
-    <w:bookmarkEnd w:id="10"/>
-    <w:bookmarkStart w:id="11" w:name="теоретическое-введение"/>
+    <w:bookmarkEnd w:id="12"/>
+    <w:bookmarkStart w:id="13" w:name="теоретическое-введение"/>
     <w:p>
       <w:pPr>
         <w:pStyle w:val="Heading1"/>
@@ -244,8 +496,8 @@
         <w:t xml:space="preserve">.</w:t>
       </w:r>
     </w:p>
-    <w:bookmarkEnd w:id="11"/>
-    <w:bookmarkStart w:id="52" w:name="выполнение-лабораторной-работы"/>
+    <w:bookmarkEnd w:id="13"/>
+    <w:bookmarkStart w:id="55" w:name="выполнение-лабораторной-работы"/>
     <w:p>
       <w:pPr>
         <w:pStyle w:val="Heading1"/>
@@ -254,7 +506,7 @@
         <w:t xml:space="preserve">Выполнение лабораторной работы</w:t>
       </w:r>
     </w:p>
-    <w:bookmarkStart w:id="12" w:name="структура-проекта"/>
+    <w:bookmarkStart w:id="15" w:name="структура-проекта"/>
     <w:p>
       <w:pPr>
         <w:pStyle w:val="Heading2"/>
@@ -268,7 +520,7 @@
         <w:pStyle w:val="FirstParagraph"/>
       </w:pPr>
       <w:r>
-        <w:t xml:space="preserve">Основная реализация находится в</w:t>
+        <w:t xml:space="preserve">Работа оформлена как воспроизводимый Julia-проект. Основная реализация находится в</w:t>
       </w:r>
       <w:r>
         <w:t xml:space="preserve"> </w:t>
@@ -358,8 +610,271 @@
         <w:t xml:space="preserve">.</w:t>
       </w:r>
     </w:p>
-    <w:bookmarkEnd w:id="12"/>
-    <w:bookmarkStart w:id="18" w:name="базовая-sir-модель"/>
+    <w:bookmarkStart w:id="14" w:name="tbl-project-structure"/>
+    <w:p>
+      <w:pPr>
+        <w:pStyle w:val="TableCaption"/>
+      </w:pPr>
+      <w:r>
+        <w:t xml:space="preserve">Структура рабочего каталога</w:t>
+      </w:r>
+    </w:p>
+    <w:tbl>
+      <w:tblPr>
+        <w:tblStyle w:val="Table"/>
+        <w:tblW w:type="pct" w:w="5000"/>
+        <w:tblLayout w:type="fixed"/>
+        <w:tblLook w:firstRow="1" w:lastRow="0" w:firstColumn="0" w:lastColumn="0" w:noHBand="0" w:noVBand="0" w:val="0020"/>
+        <w:tblCaption w:val="Структура рабочего каталога"/>
+      </w:tblPr>
+      <w:tblGrid>
+        <w:gridCol w:w="3960"/>
+        <w:gridCol w:w="3960"/>
+      </w:tblGrid>
+      <w:tr>
+        <w:trPr>
+          <w:tblHeader w:val="on"/>
+        </w:trPr>
+        <w:tc>
+          <w:tcPr/>
+          <w:p>
+            <w:pPr>
+              <w:pStyle w:val="Compact"/>
+            </w:pPr>
+            <w:r>
+              <w:t xml:space="preserve">Каталог</w:t>
+            </w:r>
+          </w:p>
+        </w:tc>
+        <w:tc>
+          <w:tcPr/>
+          <w:p>
+            <w:pPr>
+              <w:pStyle w:val="Compact"/>
+            </w:pPr>
+            <w:r>
+              <w:t xml:space="preserve">Назначение</w:t>
+            </w:r>
+          </w:p>
+        </w:tc>
+      </w:tr>
+      <w:tr>
+        <w:tc>
+          <w:tcPr/>
+          <w:p>
+            <w:pPr>
+              <w:pStyle w:val="Compact"/>
+            </w:pPr>
+            <w:r>
+              <w:rPr>
+                <w:rStyle w:val="VerbatimChar"/>
+              </w:rPr>
+              <w:t xml:space="preserve">src/</w:t>
+            </w:r>
+          </w:p>
+        </w:tc>
+        <w:tc>
+          <w:tcPr/>
+          <w:p>
+            <w:pPr>
+              <w:pStyle w:val="Compact"/>
+            </w:pPr>
+            <w:r>
+              <w:t xml:space="preserve">ядро дискретно-событийной модели</w:t>
+            </w:r>
+          </w:p>
+        </w:tc>
+      </w:tr>
+      <w:tr>
+        <w:tc>
+          <w:tcPr/>
+          <w:p>
+            <w:pPr>
+              <w:pStyle w:val="Compact"/>
+            </w:pPr>
+            <w:r>
+              <w:rPr>
+                <w:rStyle w:val="VerbatimChar"/>
+              </w:rPr>
+              <w:t xml:space="preserve">scripts/</w:t>
+            </w:r>
+          </w:p>
+        </w:tc>
+        <w:tc>
+          <w:tcPr/>
+          <w:p>
+            <w:pPr>
+              <w:pStyle w:val="Compact"/>
+            </w:pPr>
+            <w:r>
+              <w:t xml:space="preserve">сценарии запуска, экспериментов и генерации артефактов</w:t>
+            </w:r>
+          </w:p>
+        </w:tc>
+      </w:tr>
+      <w:tr>
+        <w:tc>
+          <w:tcPr/>
+          <w:p>
+            <w:pPr>
+              <w:pStyle w:val="Compact"/>
+            </w:pPr>
+            <w:r>
+              <w:rPr>
+                <w:rStyle w:val="VerbatimChar"/>
+              </w:rPr>
+              <w:t xml:space="preserve">literate/</w:t>
+            </w:r>
+          </w:p>
+        </w:tc>
+        <w:tc>
+          <w:tcPr/>
+          <w:p>
+            <w:pPr>
+              <w:pStyle w:val="Compact"/>
+            </w:pPr>
+            <w:r>
+              <w:t xml:space="preserve">литературный код для генерации</w:t>
+            </w:r>
+            <w:r>
+              <w:t xml:space="preserve"> </w:t>
+            </w:r>
+            <w:r>
+              <w:rPr>
+                <w:rStyle w:val="VerbatimChar"/>
+              </w:rPr>
+              <w:t xml:space="preserve">.jl</w:t>
+            </w:r>
+            <w:r>
+              <w:t xml:space="preserve">, notebook и документации</w:t>
+            </w:r>
+          </w:p>
+        </w:tc>
+      </w:tr>
+      <w:tr>
+        <w:tc>
+          <w:tcPr/>
+          <w:p>
+            <w:pPr>
+              <w:pStyle w:val="Compact"/>
+            </w:pPr>
+            <w:r>
+              <w:rPr>
+                <w:rStyle w:val="VerbatimChar"/>
+              </w:rPr>
+              <w:t xml:space="preserve">data/sims/</w:t>
+            </w:r>
+          </w:p>
+        </w:tc>
+        <w:tc>
+          <w:tcPr/>
+          <w:p>
+            <w:pPr>
+              <w:pStyle w:val="Compact"/>
+            </w:pPr>
+            <w:r>
+              <w:t xml:space="preserve">CSV-результаты и benchmark</w:t>
+            </w:r>
+          </w:p>
+        </w:tc>
+      </w:tr>
+      <w:tr>
+        <w:tc>
+          <w:tcPr/>
+          <w:p>
+            <w:pPr>
+              <w:pStyle w:val="Compact"/>
+            </w:pPr>
+            <w:r>
+              <w:rPr>
+                <w:rStyle w:val="VerbatimChar"/>
+              </w:rPr>
+              <w:t xml:space="preserve">plots/</w:t>
+            </w:r>
+          </w:p>
+        </w:tc>
+        <w:tc>
+          <w:tcPr/>
+          <w:p>
+            <w:pPr>
+              <w:pStyle w:val="Compact"/>
+            </w:pPr>
+            <w:r>
+              <w:t xml:space="preserve">графики экспериментов</w:t>
+            </w:r>
+          </w:p>
+        </w:tc>
+      </w:tr>
+      <w:tr>
+        <w:tc>
+          <w:tcPr/>
+          <w:p>
+            <w:pPr>
+              <w:pStyle w:val="Compact"/>
+            </w:pPr>
+            <w:r>
+              <w:rPr>
+                <w:rStyle w:val="VerbatimChar"/>
+              </w:rPr>
+              <w:t xml:space="preserve">report/</w:t>
+            </w:r>
+            <w:r>
+              <w:t xml:space="preserve">,</w:t>
+            </w:r>
+            <w:r>
+              <w:t xml:space="preserve"> </w:t>
+            </w:r>
+            <w:r>
+              <w:rPr>
+                <w:rStyle w:val="VerbatimChar"/>
+              </w:rPr>
+              <w:t xml:space="preserve">presentation/</w:t>
+            </w:r>
+          </w:p>
+        </w:tc>
+        <w:tc>
+          <w:tcPr/>
+          <w:p>
+            <w:pPr>
+              <w:pStyle w:val="Compact"/>
+            </w:pPr>
+            <w:r>
+              <w:t xml:space="preserve">исходники отчёта и презентации</w:t>
+            </w:r>
+          </w:p>
+        </w:tc>
+      </w:tr>
+      <w:tr>
+        <w:tc>
+          <w:tcPr/>
+          <w:p>
+            <w:pPr>
+              <w:pStyle w:val="Compact"/>
+            </w:pPr>
+            <w:r>
+              <w:rPr>
+                <w:rStyle w:val="VerbatimChar"/>
+              </w:rPr>
+              <w:t xml:space="preserve">release/</w:t>
+            </w:r>
+          </w:p>
+        </w:tc>
+        <w:tc>
+          <w:tcPr/>
+          <w:p>
+            <w:pPr>
+              <w:pStyle w:val="Compact"/>
+            </w:pPr>
+            <w:r>
+              <w:t xml:space="preserve">файлы для публикации в релизе</w:t>
+            </w:r>
+          </w:p>
+        </w:tc>
+      </w:tr>
+    </w:tbl>
+    <w:bookmarkEnd w:id="14"/>
+    <w:bookmarkEnd w:id="15"/>
+    <w:bookmarkStart w:id="21" w:name="базовая-sir-модель"/>
     <w:p>
       <w:pPr>
         <w:pStyle w:val="Heading2"/>
@@ -465,7 +980,7 @@
         <w:t xml:space="preserve">.</w:t>
       </w:r>
     </w:p>
-    <w:bookmarkStart w:id="13" w:name="tbl-base-params"/>
+    <w:bookmarkStart w:id="16" w:name="tbl-base-params"/>
     <w:p>
       <w:pPr>
         <w:pStyle w:val="TableCaption"/>
@@ -799,7 +1314,7 @@
         </w:tc>
       </w:tr>
     </w:tbl>
-    <w:bookmarkEnd w:id="13"/>
+    <w:bookmarkEnd w:id="16"/>
     <w:p>
       <w:pPr>
         <w:pStyle w:val="BodyText"/>
@@ -820,7 +1335,7 @@
         <w:t xml:space="preserve">показана динамика базовой дискретно-событийной модели.</w:t>
       </w:r>
     </w:p>
-    <w:bookmarkStart w:id="17" w:name="fig-sir-des"/>
+    <w:bookmarkStart w:id="20" w:name="fig-sir-des"/>
     <w:p>
       <w:pPr>
         <w:pStyle w:val="CaptionedFigure"/>
@@ -830,18 +1345,18 @@
           <wp:inline>
             <wp:extent cx="4800600" cy="3200400"/>
             <wp:effectExtent b="0" l="0" r="0" t="0"/>
-            <wp:docPr descr="Базовая дискретно-событийная SIR модель" title="" id="15" name="Picture"/>
+            <wp:docPr descr="Базовая дискретно-событийная SIR модель" title="" id="18" name="Picture"/>
             <a:graphic>
               <a:graphicData uri="http://schemas.openxmlformats.org/drawingml/2006/picture">
                 <pic:pic>
                   <pic:nvPicPr>
-                    <pic:cNvPr descr="../plots/sir_des.png" id="16" name="Picture"/>
+                    <pic:cNvPr descr="../plots/sir_des.png" id="19" name="Picture"/>
                     <pic:cNvPicPr>
                       <a:picLocks noChangeArrowheads="1" noChangeAspect="1"/>
                     </pic:cNvPicPr>
                   </pic:nvPicPr>
                   <pic:blipFill>
-                    <a:blip r:embed="rId14"/>
+                    <a:blip r:embed="rId17"/>
                     <a:stretch>
                       <a:fillRect/>
                     </a:stretch>
@@ -876,9 +1391,9 @@
         <w:t xml:space="preserve">Базовая дискретно-событийная SIR модель</w:t>
       </w:r>
     </w:p>
-    <w:bookmarkEnd w:id="17"/>
-    <w:bookmarkEnd w:id="18"/>
-    <w:bookmarkStart w:id="31" w:name="анализ-чувствительности"/>
+    <w:bookmarkEnd w:id="20"/>
+    <w:bookmarkEnd w:id="21"/>
+    <w:bookmarkStart w:id="34" w:name="анализ-чувствительности"/>
     <w:p>
       <w:pPr>
         <w:pStyle w:val="Heading2"/>
@@ -1017,7 +1532,7 @@
         <w:t xml:space="preserve">.</w:t>
       </w:r>
     </w:p>
-    <w:bookmarkStart w:id="22" w:name="fig-beta-003"/>
+    <w:bookmarkStart w:id="25" w:name="fig-beta-003"/>
     <w:p>
       <w:pPr>
         <w:pStyle w:val="CaptionedFigure"/>
@@ -1027,18 +1542,18 @@
           <wp:inline>
             <wp:extent cx="4267200" cy="2844800"/>
             <wp:effectExtent b="0" l="0" r="0" t="0"/>
-            <wp:docPr descr="SIR при β=0.03" title="" id="20" name="Picture"/>
+            <wp:docPr descr="SIR при β=0.03" title="" id="23" name="Picture"/>
             <a:graphic>
               <a:graphicData uri="http://schemas.openxmlformats.org/drawingml/2006/picture">
                 <pic:pic>
                   <pic:nvPicPr>
-                    <pic:cNvPr descr="../plots/sir_beta_0.03.png" id="21" name="Picture"/>
+                    <pic:cNvPr descr="../plots/sir_beta_0.03.png" id="24" name="Picture"/>
                     <pic:cNvPicPr>
                       <a:picLocks noChangeArrowheads="1" noChangeAspect="1"/>
                     </pic:cNvPicPr>
                   </pic:nvPicPr>
                   <pic:blipFill>
-                    <a:blip r:embed="rId19"/>
+                    <a:blip r:embed="rId22"/>
                     <a:stretch>
                       <a:fillRect/>
                     </a:stretch>
@@ -1073,8 +1588,8 @@
         <w:t xml:space="preserve">SIR при β=0.03</w:t>
       </w:r>
     </w:p>
-    <w:bookmarkEnd w:id="22"/>
-    <w:bookmarkStart w:id="26" w:name="fig-beta-005"/>
+    <w:bookmarkEnd w:id="25"/>
+    <w:bookmarkStart w:id="29" w:name="fig-beta-005"/>
     <w:p>
       <w:pPr>
         <w:pStyle w:val="CaptionedFigure"/>
@@ -1084,18 +1599,18 @@
           <wp:inline>
             <wp:extent cx="4267200" cy="2844800"/>
             <wp:effectExtent b="0" l="0" r="0" t="0"/>
-            <wp:docPr descr="SIR при β=0.05" title="" id="24" name="Picture"/>
+            <wp:docPr descr="SIR при β=0.05" title="" id="27" name="Picture"/>
             <a:graphic>
               <a:graphicData uri="http://schemas.openxmlformats.org/drawingml/2006/picture">
                 <pic:pic>
                   <pic:nvPicPr>
-                    <pic:cNvPr descr="../plots/sir_beta_0.05.png" id="25" name="Picture"/>
+                    <pic:cNvPr descr="../plots/sir_beta_0.05.png" id="28" name="Picture"/>
                     <pic:cNvPicPr>
                       <a:picLocks noChangeArrowheads="1" noChangeAspect="1"/>
                     </pic:cNvPicPr>
                   </pic:nvPicPr>
                   <pic:blipFill>
-                    <a:blip r:embed="rId23"/>
+                    <a:blip r:embed="rId26"/>
                     <a:stretch>
                       <a:fillRect/>
                     </a:stretch>
@@ -1130,8 +1645,8 @@
         <w:t xml:space="preserve">SIR при β=0.05</w:t>
       </w:r>
     </w:p>
-    <w:bookmarkEnd w:id="26"/>
-    <w:bookmarkStart w:id="30" w:name="fig-beta-007"/>
+    <w:bookmarkEnd w:id="29"/>
+    <w:bookmarkStart w:id="33" w:name="fig-beta-007"/>
     <w:p>
       <w:pPr>
         <w:pStyle w:val="CaptionedFigure"/>
@@ -1141,18 +1656,18 @@
           <wp:inline>
             <wp:extent cx="4267200" cy="2844800"/>
             <wp:effectExtent b="0" l="0" r="0" t="0"/>
-            <wp:docPr descr="SIR при β=0.07" title="" id="28" name="Picture"/>
+            <wp:docPr descr="SIR при β=0.07" title="" id="31" name="Picture"/>
             <a:graphic>
               <a:graphicData uri="http://schemas.openxmlformats.org/drawingml/2006/picture">
                 <pic:pic>
                   <pic:nvPicPr>
-                    <pic:cNvPr descr="../plots/sir_beta_0.07.png" id="29" name="Picture"/>
+                    <pic:cNvPr descr="../plots/sir_beta_0.07.png" id="32" name="Picture"/>
                     <pic:cNvPicPr>
                       <a:picLocks noChangeArrowheads="1" noChangeAspect="1"/>
                     </pic:cNvPicPr>
                   </pic:nvPicPr>
                   <pic:blipFill>
-                    <a:blip r:embed="rId27"/>
+                    <a:blip r:embed="rId30"/>
                     <a:stretch>
                       <a:fillRect/>
                     </a:stretch>
@@ -1187,9 +1702,9 @@
         <w:t xml:space="preserve">SIR при β=0.07</w:t>
       </w:r>
     </w:p>
-    <w:bookmarkEnd w:id="30"/>
-    <w:bookmarkEnd w:id="31"/>
-    <w:bookmarkStart w:id="36" w:name="детерминированная-длительность-болезни"/>
+    <w:bookmarkEnd w:id="33"/>
+    <w:bookmarkEnd w:id="34"/>
+    <w:bookmarkStart w:id="39" w:name="детерминированная-длительность-болезни"/>
     <w:p>
       <w:pPr>
         <w:pStyle w:val="Heading2"/>
@@ -1227,7 +1742,7 @@
         <w:t xml:space="preserve">.</w:t>
       </w:r>
     </w:p>
-    <w:bookmarkStart w:id="35" w:name="fig-recovery-compare"/>
+    <w:bookmarkStart w:id="38" w:name="fig-recovery-compare"/>
     <w:p>
       <w:pPr>
         <w:pStyle w:val="CaptionedFigure"/>
@@ -1237,18 +1752,18 @@
           <wp:inline>
             <wp:extent cx="4800600" cy="3200400"/>
             <wp:effectExtent b="0" l="0" r="0" t="0"/>
-            <wp:docPr descr="Сравнение стохастического и детерминированного выздоровления" title="" id="33" name="Picture"/>
+            <wp:docPr descr="Сравнение стохастического и детерминированного выздоровления" title="" id="36" name="Picture"/>
             <a:graphic>
               <a:graphicData uri="http://schemas.openxmlformats.org/drawingml/2006/picture">
                 <pic:pic>
                   <pic:nvPicPr>
-                    <pic:cNvPr descr="../plots/sir_recovery_compare.png" id="34" name="Picture"/>
+                    <pic:cNvPr descr="../plots/sir_recovery_compare.png" id="37" name="Picture"/>
                     <pic:cNvPicPr>
                       <a:picLocks noChangeArrowheads="1" noChangeAspect="1"/>
                     </pic:cNvPicPr>
                   </pic:nvPicPr>
                   <pic:blipFill>
-                    <a:blip r:embed="rId32"/>
+                    <a:blip r:embed="rId35"/>
                     <a:stretch>
                       <a:fillRect/>
                     </a:stretch>
@@ -1283,9 +1798,9 @@
         <w:t xml:space="preserve">Сравнение стохастического и детерминированного выздоровления</w:t>
       </w:r>
     </w:p>
-    <w:bookmarkEnd w:id="35"/>
-    <w:bookmarkEnd w:id="36"/>
-    <w:bookmarkStart w:id="49" w:name="вакцинация-демография-и-seir"/>
+    <w:bookmarkEnd w:id="38"/>
+    <w:bookmarkEnd w:id="39"/>
+    <w:bookmarkStart w:id="52" w:name="вакцинация-демография-и-seir"/>
     <w:p>
       <w:pPr>
         <w:pStyle w:val="Heading2"/>
@@ -1341,7 +1856,7 @@
         <w:t xml:space="preserve">.</w:t>
       </w:r>
     </w:p>
-    <w:bookmarkStart w:id="40" w:name="fig-vaccination"/>
+    <w:bookmarkStart w:id="43" w:name="fig-vaccination"/>
     <w:p>
       <w:pPr>
         <w:pStyle w:val="CaptionedFigure"/>
@@ -1351,18 +1866,18 @@
           <wp:inline>
             <wp:extent cx="4800600" cy="3200400"/>
             <wp:effectExtent b="0" l="0" r="0" t="0"/>
-            <wp:docPr descr="SIR модель с вакцинацией" title="" id="38" name="Picture"/>
+            <wp:docPr descr="SIR модель с вакцинацией" title="" id="41" name="Picture"/>
             <a:graphic>
               <a:graphicData uri="http://schemas.openxmlformats.org/drawingml/2006/picture">
                 <pic:pic>
                   <pic:nvPicPr>
-                    <pic:cNvPr descr="../plots/sir_vaccination.png" id="39" name="Picture"/>
+                    <pic:cNvPr descr="../plots/sir_vaccination.png" id="42" name="Picture"/>
                     <pic:cNvPicPr>
                       <a:picLocks noChangeArrowheads="1" noChangeAspect="1"/>
                     </pic:cNvPicPr>
                   </pic:nvPicPr>
                   <pic:blipFill>
-                    <a:blip r:embed="rId37"/>
+                    <a:blip r:embed="rId40"/>
                     <a:stretch>
                       <a:fillRect/>
                     </a:stretch>
@@ -1397,7 +1912,7 @@
         <w:t xml:space="preserve">SIR модель с вакцинацией</w:t>
       </w:r>
     </w:p>
-    <w:bookmarkEnd w:id="40"/>
+    <w:bookmarkEnd w:id="43"/>
     <w:p>
       <w:pPr>
         <w:pStyle w:val="BodyText"/>
@@ -1415,7 +1930,7 @@
         <w:t xml:space="preserve">.</w:t>
       </w:r>
     </w:p>
-    <w:bookmarkStart w:id="44" w:name="fig-demographic"/>
+    <w:bookmarkStart w:id="47" w:name="fig-demographic"/>
     <w:p>
       <w:pPr>
         <w:pStyle w:val="CaptionedFigure"/>
@@ -1425,18 +1940,18 @@
           <wp:inline>
             <wp:extent cx="4800600" cy="3200400"/>
             <wp:effectExtent b="0" l="0" r="0" t="0"/>
-            <wp:docPr descr="SIR модель с демографическими событиями" title="" id="42" name="Picture"/>
+            <wp:docPr descr="SIR модель с демографическими событиями" title="" id="45" name="Picture"/>
             <a:graphic>
               <a:graphicData uri="http://schemas.openxmlformats.org/drawingml/2006/picture">
                 <pic:pic>
                   <pic:nvPicPr>
-                    <pic:cNvPr descr="../plots/sir_demographic.png" id="43" name="Picture"/>
+                    <pic:cNvPr descr="../plots/sir_demographic.png" id="46" name="Picture"/>
                     <pic:cNvPicPr>
                       <a:picLocks noChangeArrowheads="1" noChangeAspect="1"/>
                     </pic:cNvPicPr>
                   </pic:nvPicPr>
                   <pic:blipFill>
-                    <a:blip r:embed="rId41"/>
+                    <a:blip r:embed="rId44"/>
                     <a:stretch>
                       <a:fillRect/>
                     </a:stretch>
@@ -1471,7 +1986,7 @@
         <w:t xml:space="preserve">SIR модель с демографическими событиями</w:t>
       </w:r>
     </w:p>
-    <w:bookmarkEnd w:id="44"/>
+    <w:bookmarkEnd w:id="47"/>
     <w:p>
       <w:pPr>
         <w:pStyle w:val="BodyText"/>
@@ -1537,7 +2052,7 @@
         <w:t xml:space="preserve">.</w:t>
       </w:r>
     </w:p>
-    <w:bookmarkStart w:id="48" w:name="fig-seir"/>
+    <w:bookmarkStart w:id="51" w:name="fig-seir"/>
     <w:p>
       <w:pPr>
         <w:pStyle w:val="CaptionedFigure"/>
@@ -1547,18 +2062,18 @@
           <wp:inline>
             <wp:extent cx="4800600" cy="3200400"/>
             <wp:effectExtent b="0" l="0" r="0" t="0"/>
-            <wp:docPr descr="SEIR модель с латентным периодом" title="" id="46" name="Picture"/>
+            <wp:docPr descr="SEIR модель с латентным периодом" title="" id="49" name="Picture"/>
             <a:graphic>
               <a:graphicData uri="http://schemas.openxmlformats.org/drawingml/2006/picture">
                 <pic:pic>
                   <pic:nvPicPr>
-                    <pic:cNvPr descr="../plots/seir.png" id="47" name="Picture"/>
+                    <pic:cNvPr descr="../plots/seir.png" id="50" name="Picture"/>
                     <pic:cNvPicPr>
                       <a:picLocks noChangeArrowheads="1" noChangeAspect="1"/>
                     </pic:cNvPicPr>
                   </pic:nvPicPr>
                   <pic:blipFill>
-                    <a:blip r:embed="rId45"/>
+                    <a:blip r:embed="rId48"/>
                     <a:stretch>
                       <a:fillRect/>
                     </a:stretch>
@@ -1593,109 +2108,15 @@
         <w:t xml:space="preserve">SEIR модель с латентным периодом</w:t>
       </w:r>
     </w:p>
-    <w:bookmarkEnd w:id="48"/>
-    <w:bookmarkEnd w:id="49"/>
-    <w:bookmarkStart w:id="50" w:name="производительность"/>
-    <w:p>
-      <w:pPr>
-        <w:pStyle w:val="Heading2"/>
-      </w:pPr>
-      <w:r>
-        <w:t xml:space="preserve">Производительность</w:t>
-      </w:r>
-    </w:p>
-    <w:p>
-      <w:pPr>
-        <w:pStyle w:val="FirstParagraph"/>
-      </w:pPr>
-      <w:r>
-        <w:t xml:space="preserve">Для оценки производительности используется</w:t>
-      </w:r>
-      <w:r>
-        <w:t xml:space="preserve"> </w:t>
-      </w:r>
-      <w:r>
-        <w:rPr>
-          <w:rStyle w:val="VerbatimChar"/>
-        </w:rPr>
-        <w:t xml:space="preserve">BenchmarkTools.@benchmark</w:t>
-      </w:r>
-      <w:r>
-        <w:t xml:space="preserve"> </w:t>
-      </w:r>
-      <w:r>
-        <w:t xml:space="preserve">на популяции 10000 индивидов. Результат сохраняется в</w:t>
-      </w:r>
-      <w:r>
-        <w:t xml:space="preserve"> </w:t>
-      </w:r>
-      <w:r>
-        <w:rPr>
-          <w:rStyle w:val="VerbatimChar"/>
-        </w:rPr>
-        <w:t xml:space="preserve">data/sims/benchmark.txt</w:t>
-      </w:r>
-      <w:r>
-        <w:t xml:space="preserve">. Возможные направления оптимизации: хранить списки индивидов по состояниям, предварительно генерировать случайные величины, уменьшать число обращений к полному массиву агентов при выборе контакта.</w:t>
-      </w:r>
-    </w:p>
-    <w:bookmarkEnd w:id="50"/>
-    <w:bookmarkStart w:id="51" w:name="литературный-код"/>
-    <w:p>
-      <w:pPr>
-        <w:pStyle w:val="Heading2"/>
-      </w:pPr>
-      <w:r>
-        <w:t xml:space="preserve">Литературный код</w:t>
-      </w:r>
-    </w:p>
-    <w:p>
-      <w:pPr>
-        <w:pStyle w:val="FirstParagraph"/>
-      </w:pPr>
-      <w:r>
-        <w:t xml:space="preserve">Файлы</w:t>
-      </w:r>
-      <w:r>
-        <w:t xml:space="preserve"> </w:t>
-      </w:r>
-      <w:r>
-        <w:rPr>
-          <w:rStyle w:val="VerbatimChar"/>
-        </w:rPr>
-        <w:t xml:space="preserve">literate/sir_literate.jl</w:t>
-      </w:r>
-      <w:r>
-        <w:t xml:space="preserve"> </w:t>
-      </w:r>
-      <w:r>
-        <w:t xml:space="preserve">и</w:t>
-      </w:r>
-      <w:r>
-        <w:t xml:space="preserve"> </w:t>
-      </w:r>
-      <w:r>
-        <w:rPr>
-          <w:rStyle w:val="VerbatimChar"/>
-        </w:rPr>
-        <w:t xml:space="preserve">literate/sir_parameters.jl</w:t>
-      </w:r>
-      <w:r>
-        <w:t xml:space="preserve"> </w:t>
-      </w:r>
-      <w:r>
-        <w:t xml:space="preserve">являются источниками, из которых генерируются чистые Julia-скрипты, Jupyter notebooks и Markdown/Quarto-документация. Это обеспечивает воспроизводимость: один источник используется для кода, notebook и документации.</w:t>
-      </w:r>
-    </w:p>
     <w:bookmarkEnd w:id="51"/>
     <w:bookmarkEnd w:id="52"/>
-    <w:bookmarkStart w:id="53" w:name="выводы"/>
-    <w:p>
-      <w:pPr>
-        <w:pStyle w:val="Heading1"/>
-      </w:pPr>
-      <w:r>
-        <w:t xml:space="preserve">Выводы</w:t>
+    <w:bookmarkStart w:id="53" w:name="производительность"/>
+    <w:p>
+      <w:pPr>
+        <w:pStyle w:val="Heading2"/>
+      </w:pPr>
+      <w:r>
+        <w:t xml:space="preserve">Производительность</w:t>
       </w:r>
     </w:p>
     <w:p>
@@ -1703,22 +2124,116 @@
         <w:pStyle w:val="FirstParagraph"/>
       </w:pPr>
       <w:r>
-        <w:t xml:space="preserve">В ходе работы реализована дискретно-событийная стохастическая SIR модель на Julia, выполнен базовый прогон, сохранены графики и CSV-файлы, проведён анализ чувствительности параметров, добавлены модификации с детерминированным выздоровлением, вакцинацией, демографическими событиями и латентным периодом SEIR. Подготовлены литературные исходники, notebook, Quarto-документация, отчёт и презентация.</w:t>
+        <w:t xml:space="preserve">Для оценки производительности используется</w:t>
+      </w:r>
+      <w:r>
+        <w:t xml:space="preserve"> </w:t>
+      </w:r>
+      <w:r>
+        <w:rPr>
+          <w:rStyle w:val="VerbatimChar"/>
+        </w:rPr>
+        <w:t xml:space="preserve">BenchmarkTools.@benchmark</w:t>
+      </w:r>
+      <w:r>
+        <w:t xml:space="preserve"> </w:t>
+      </w:r>
+      <w:r>
+        <w:t xml:space="preserve">на популяции 10000 индивидов. Результат сохраняется в</w:t>
+      </w:r>
+      <w:r>
+        <w:t xml:space="preserve"> </w:t>
+      </w:r>
+      <w:r>
+        <w:rPr>
+          <w:rStyle w:val="VerbatimChar"/>
+        </w:rPr>
+        <w:t xml:space="preserve">data/sims/benchmark.txt</w:t>
+      </w:r>
+      <w:r>
+        <w:t xml:space="preserve">. Возможные направления оптимизации: хранить списки индивидов по состояниям, предварительно генерировать случайные величины, уменьшать число обращений к полному массиву агентов при выборе контакта.</w:t>
       </w:r>
     </w:p>
     <w:bookmarkEnd w:id="53"/>
-    <w:bookmarkStart w:id="55" w:name="список-литературы"/>
-    <w:p>
-      <w:pPr>
-        <w:pStyle w:val="Heading1"/>
-      </w:pPr>
-      <w:r>
-        <w:t xml:space="preserve">Список литературы</w:t>
-      </w:r>
-    </w:p>
-    <w:bookmarkStart w:id="54" w:name="refs"/>
+    <w:bookmarkStart w:id="54" w:name="литературный-код"/>
+    <w:p>
+      <w:pPr>
+        <w:pStyle w:val="Heading2"/>
+      </w:pPr>
+      <w:r>
+        <w:t xml:space="preserve">Литературный код</w:t>
+      </w:r>
+    </w:p>
+    <w:p>
+      <w:pPr>
+        <w:pStyle w:val="FirstParagraph"/>
+      </w:pPr>
+      <w:r>
+        <w:t xml:space="preserve">Файлы</w:t>
+      </w:r>
+      <w:r>
+        <w:t xml:space="preserve"> </w:t>
+      </w:r>
+      <w:r>
+        <w:rPr>
+          <w:rStyle w:val="VerbatimChar"/>
+        </w:rPr>
+        <w:t xml:space="preserve">literate/sir_literate.jl</w:t>
+      </w:r>
+      <w:r>
+        <w:t xml:space="preserve"> </w:t>
+      </w:r>
+      <w:r>
+        <w:t xml:space="preserve">и</w:t>
+      </w:r>
+      <w:r>
+        <w:t xml:space="preserve"> </w:t>
+      </w:r>
+      <w:r>
+        <w:rPr>
+          <w:rStyle w:val="VerbatimChar"/>
+        </w:rPr>
+        <w:t xml:space="preserve">literate/sir_parameters.jl</w:t>
+      </w:r>
+      <w:r>
+        <w:t xml:space="preserve"> </w:t>
+      </w:r>
+      <w:r>
+        <w:t xml:space="preserve">являются источниками, из которых генерируются чистые Julia-скрипты, Jupyter notebooks и Markdown/Quarto-документация. Это обеспечивает воспроизводимость: один источник используется для кода, notebook и документации.</w:t>
+      </w:r>
+    </w:p>
     <w:bookmarkEnd w:id="54"/>
     <w:bookmarkEnd w:id="55"/>
+    <w:bookmarkStart w:id="56" w:name="выводы"/>
+    <w:p>
+      <w:pPr>
+        <w:pStyle w:val="Heading1"/>
+      </w:pPr>
+      <w:r>
+        <w:t xml:space="preserve">Выводы</w:t>
+      </w:r>
+    </w:p>
+    <w:p>
+      <w:pPr>
+        <w:pStyle w:val="FirstParagraph"/>
+      </w:pPr>
+      <w:r>
+        <w:t xml:space="preserve">В ходе работы реализована дискретно-событийная стохастическая SIR модель на Julia, выполнен базовый прогон, сохранены графики и CSV-файлы, проведён анализ чувствительности параметров, добавлены модификации с детерминированным выздоровлением, вакцинацией, демографическими событиями и латентным периодом SEIR. Подготовлены литературные исходники, notebook, Quarto-документация, отчёт и презентация.</w:t>
+      </w:r>
+    </w:p>
+    <w:bookmarkEnd w:id="56"/>
+    <w:bookmarkStart w:id="58" w:name="список-литературы"/>
+    <w:p>
+      <w:pPr>
+        <w:pStyle w:val="Heading1"/>
+      </w:pPr>
+      <w:r>
+        <w:t xml:space="preserve">Список литературы</w:t>
+      </w:r>
+    </w:p>
+    <w:bookmarkStart w:id="57" w:name="refs"/>
+    <w:bookmarkEnd w:id="57"/>
+    <w:bookmarkEnd w:id="58"/>
     <w:sectPr>
       <w:footnotePr>
         <w:numRestart w:val="eachSect"/>

</xml_diff>